<commit_message>
docs: add Reminders & Scheduling section to HLD
Co-Authored-By: Claude Opus 4.8 (1M context) <noreply@anthropic.com>
</commit_message>
<xml_diff>
--- a/Document/HLD-daily-compass.docx
+++ b/Document/HLD-daily-compass.docx
@@ -780,7 +780,234 @@
         <w:pStyle w:val="Heading1"/>
       </w:pPr>
       <w:r>
-        <w:t>8. Cost</w:t>
+        <w:t>8. Reminders &amp; Scheduling (Later Phase)</w:t>
+      </w:r>
+    </w:p>
+    <w:p>
+      <w:r>
+        <w:rPr>
+          <w:b w:val="0"/>
+          <w:i w:val="0"/>
+        </w:rPr>
+        <w:t>The system can trigger reminders and run tasks on a schedule without the owner operating any server. Scheduling uses managed ("serverless") compute that the provider runs on a timer and shuts down again — no VPS, no uptime to maintain.</w:t>
+      </w:r>
+    </w:p>
+    <w:p>
+      <w:pPr>
+        <w:pStyle w:val="Heading2"/>
+      </w:pPr>
+      <w:r>
+        <w:t>Reminder types</w:t>
+      </w:r>
+    </w:p>
+    <w:p>
+      <w:pPr>
+        <w:pStyle w:val="ListBullet"/>
+      </w:pPr>
+      <w:r>
+        <w:t>On-page reminder (app open): pure client-side JavaScript. Already part of v1.</w:t>
+      </w:r>
+    </w:p>
+    <w:p>
+      <w:pPr>
+        <w:pStyle w:val="ListBullet"/>
+      </w:pPr>
+      <w:r>
+        <w:t>Push reminder (app closed / phone idle): needs a scheduler plus a delivery channel. This is the later-phase work described here.</w:t>
+      </w:r>
+    </w:p>
+    <w:p>
+      <w:pPr>
+        <w:pStyle w:val="Heading2"/>
+      </w:pPr>
+      <w:r>
+        <w:t>Scheduling engines (free)</w:t>
+      </w:r>
+    </w:p>
+    <w:p>
+      <w:pPr>
+        <w:pStyle w:val="ListBullet"/>
+      </w:pPr>
+      <w:r>
+        <w:t>GitHub Actions cron: a scheduled job in the repo runs a small script every N minutes (minimum 5-minute interval; may lag a few minutes). The script queries Supabase, decides, and sends reminders. Free quota: 2000 run-minutes/month on private repos, unlimited on public repos. Typical personal use (a ~30-second check every 15–30 minutes) stays well under the limit.</w:t>
+      </w:r>
+    </w:p>
+    <w:p>
+      <w:pPr>
+        <w:pStyle w:val="ListBullet"/>
+      </w:pPr>
+      <w:r>
+        <w:t>Supabase scheduled jobs (pg_cron + Edge Functions): Supabase runs SQL or a serverless function on a schedule, close to the data. Included in the free tier.</w:t>
+      </w:r>
+    </w:p>
+    <w:p>
+      <w:pPr>
+        <w:pStyle w:val="Heading2"/>
+      </w:pPr>
+      <w:r>
+        <w:t>Delivery channels (free)</w:t>
+      </w:r>
+    </w:p>
+    <w:tbl>
+      <w:tblPr>
+        <w:tblStyle w:val="LightGrid-Accent1"/>
+        <w:tblW w:type="auto" w:w="0"/>
+        <w:tblLook w:firstColumn="1" w:firstRow="1" w:lastColumn="0" w:lastRow="0" w:noHBand="0" w:noVBand="1" w:val="04A0"/>
+      </w:tblPr>
+      <w:tblGrid>
+        <w:gridCol w:w="4320"/>
+        <w:gridCol w:w="4320"/>
+      </w:tblGrid>
+      <w:tr>
+        <w:tc>
+          <w:tcPr>
+            <w:tcW w:type="dxa" w:w="4320"/>
+          </w:tcPr>
+          <w:p>
+            <w:r>
+              <w:rPr>
+                <w:b/>
+              </w:rPr>
+              <w:t>Channel</w:t>
+            </w:r>
+          </w:p>
+        </w:tc>
+        <w:tc>
+          <w:tcPr>
+            <w:tcW w:type="dxa" w:w="4320"/>
+          </w:tcPr>
+          <w:p>
+            <w:r>
+              <w:rPr>
+                <w:b/>
+              </w:rPr>
+              <w:t>Notes</w:t>
+            </w:r>
+          </w:p>
+        </w:tc>
+      </w:tr>
+      <w:tr>
+        <w:tc>
+          <w:tcPr>
+            <w:tcW w:type="dxa" w:w="4320"/>
+          </w:tcPr>
+          <w:p>
+            <w:r>
+              <w:t>Email (e.g. Resend/SendGrid)</w:t>
+            </w:r>
+          </w:p>
+        </w:tc>
+        <w:tc>
+          <w:tcPr>
+            <w:tcW w:type="dxa" w:w="4320"/>
+          </w:tcPr>
+          <w:p>
+            <w:r>
+              <w:t>~100/day free; simplest, reliable.</w:t>
+            </w:r>
+          </w:p>
+        </w:tc>
+      </w:tr>
+      <w:tr>
+        <w:tc>
+          <w:tcPr>
+            <w:tcW w:type="dxa" w:w="4320"/>
+          </w:tcPr>
+          <w:p>
+            <w:r>
+              <w:t>Web Push (browser notif)</w:t>
+            </w:r>
+          </w:p>
+        </w:tc>
+        <w:tc>
+          <w:tcPr>
+            <w:tcW w:type="dxa" w:w="4320"/>
+          </w:tcPr>
+          <w:p>
+            <w:r>
+              <w:t>Free; requires the PWA service worker.</w:t>
+            </w:r>
+          </w:p>
+        </w:tc>
+      </w:tr>
+      <w:tr>
+        <w:tc>
+          <w:tcPr>
+            <w:tcW w:type="dxa" w:w="4320"/>
+          </w:tcPr>
+          <w:p>
+            <w:r>
+              <w:t>Telegram bot</w:t>
+            </w:r>
+          </w:p>
+        </w:tc>
+        <w:tc>
+          <w:tcPr>
+            <w:tcW w:type="dxa" w:w="4320"/>
+          </w:tcPr>
+          <w:p>
+            <w:r>
+              <w:t>Free, instant; easy for personal use.</w:t>
+            </w:r>
+          </w:p>
+        </w:tc>
+      </w:tr>
+    </w:tbl>
+    <w:p>
+      <w:r>
+        <w:rPr>
+          <w:b w:val="0"/>
+          <w:i w:val="0"/>
+        </w:rPr>
+      </w:r>
+    </w:p>
+    <w:p>
+      <w:pPr>
+        <w:pStyle w:val="Heading2"/>
+      </w:pPr>
+      <w:r>
+        <w:t>Example flows</w:t>
+      </w:r>
+    </w:p>
+    <w:p>
+      <w:pPr>
+        <w:pStyle w:val="ListBullet"/>
+      </w:pPr>
+      <w:r>
+        <w:t>If no wakeup logged by 09:00, send a nudge.</w:t>
+      </w:r>
+    </w:p>
+    <w:p>
+      <w:pPr>
+        <w:pStyle w:val="ListBullet"/>
+      </w:pPr>
+      <w:r>
+        <w:t>A daily 22:00 "log sleep" reminder.</w:t>
+      </w:r>
+    </w:p>
+    <w:p>
+      <w:pPr>
+        <w:pStyle w:val="ListBullet"/>
+      </w:pPr>
+      <w:r>
+        <w:t>Periodic reminders during the eating window.</w:t>
+      </w:r>
+    </w:p>
+    <w:p>
+      <w:r>
+        <w:rPr>
+          <w:b w:val="0"/>
+          <w:i w:val="0"/>
+        </w:rPr>
+        <w:t>The v1 static app stays static; only this scheduling piece borrows managed compute on a timer. Cost remains $0.</w:t>
+      </w:r>
+    </w:p>
+    <w:p>
+      <w:pPr>
+        <w:pStyle w:val="Heading1"/>
+      </w:pPr>
+      <w:r>
+        <w:t>9. Cost</w:t>
       </w:r>
     </w:p>
     <w:tbl>
@@ -984,7 +1211,7 @@
         <w:pStyle w:val="Heading1"/>
       </w:pPr>
       <w:r>
-        <w:t>9. Open Questions (resolve at planning stage)</w:t>
+        <w:t>10. Open Questions (resolve at planning stage)</w:t>
       </w:r>
     </w:p>
     <w:p>

</xml_diff>

<commit_message>
docs: add Portability & Migration section to HLD
Co-Authored-By: Claude Opus 4.8 (1M context) <noreply@anthropic.com>
</commit_message>
<xml_diff>
--- a/Document/HLD-daily-compass.docx
+++ b/Document/HLD-daily-compass.docx
@@ -1007,7 +1007,57 @@
         <w:pStyle w:val="Heading1"/>
       </w:pPr>
       <w:r>
-        <w:t>9. Cost</w:t>
+        <w:t>9. Portability &amp; Migration</w:t>
+      </w:r>
+    </w:p>
+    <w:p>
+      <w:r>
+        <w:rPr>
+          <w:b w:val="0"/>
+          <w:i w:val="0"/>
+        </w:rPr>
+        <w:t>The design avoids vendor lock-in so the app can move to AWS or another provider later with low effort.</w:t>
+      </w:r>
+    </w:p>
+    <w:p>
+      <w:pPr>
+        <w:pStyle w:val="ListBullet"/>
+      </w:pPr>
+      <w:r>
+        <w:t>Standard database. Supabase stores data in plain Postgres. Postgres is an open standard, so the data exports from Supabase and imports into any other Postgres host (e.g. AWS RDS) with a dump/restore — essentially a copy. Postgres was chosen over a proprietary store (e.g. Firebase) specifically for this.</w:t>
+      </w:r>
+    </w:p>
+    <w:p>
+      <w:pPr>
+        <w:pStyle w:val="ListBullet"/>
+      </w:pPr>
+      <w:r>
+        <w:t>Single data-access layer. All database and auth calls go through one module in the frontend (app code → data-access module → Supabase SDK), not scattered across the app. To switch backend later, only this one module is rewritten; the rest of the app is untouched. This turns a potential multi-week rip-out into roughly a weekend.</w:t>
+      </w:r>
+    </w:p>
+    <w:p>
+      <w:pPr>
+        <w:pStyle w:val="ListBullet"/>
+      </w:pPr>
+      <w:r>
+        <w:t>Static app. The frontend is plain static files, movable to any host (S3, etc.) in minutes.</w:t>
+      </w:r>
+    </w:p>
+    <w:p>
+      <w:r>
+        <w:rPr>
+          <w:b w:val="0"/>
+          <w:i w:val="0"/>
+        </w:rPr>
+        <w:t>This is a v1 design rule (the data-access module), not deferred work — adopting it up front is what keeps migration cheap.</w:t>
+      </w:r>
+    </w:p>
+    <w:p>
+      <w:pPr>
+        <w:pStyle w:val="Heading1"/>
+      </w:pPr>
+      <w:r>
+        <w:t>10. Cost</w:t>
       </w:r>
     </w:p>
     <w:tbl>
@@ -1211,7 +1261,7 @@
         <w:pStyle w:val="Heading1"/>
       </w:pPr>
       <w:r>
-        <w:t>10. Open Questions (resolve at planning stage)</w:t>
+        <w:t>11. Open Questions (resolve at planning stage)</w:t>
       </w:r>
     </w:p>
     <w:p>

</xml_diff>